<commit_message>
Add soundtrack design section and 11-avatar gallery to H5 submission docx
</commit_message>
<xml_diff>
--- a/submission/word/8.8元到账之后-投稿材料-修订版.docx
+++ b/submission/word/8.8元到账之后-投稿材料-修订版.docx
@@ -882,7 +882,7 @@
           <w:sz w:val="19"/>
           <w:szCs w:val="19"/>
         </w:rPr>
-        <w:t xml:space="preserve">反转一：“同学也是传播链上的帮凶”</w:t>
+        <w:t xml:space="preserve">明暗双轨配乐《信任泡沫》</w:t>
       </w:r>
     </w:p>
     <w:p>
@@ -898,7 +898,7 @@
           <w:sz w:val="22"/>
           <w:szCs w:val="22"/>
         </w:rPr>
-        <w:t xml:space="preserve">剧情中的周然没有恶意，他只是把自己那一次到账当成了平台可信，并在拉新奖励的驱动下把链接转给了主角。作品刻意保留“无意间”“未经核验”的语境：这一段只讲未经核验的热心会替骗子带路，属于传播链层面的描述，不给同学做法律定性。这个反转让传播链（骗子—周然—主角—室友）第一次被体验者亲眼看见。</w:t>
+        <w:t xml:space="preserve">配乐为原创双轨作品《信任泡沫》：92 BPM、E 小调、约 42 秒无歌词循环，明暗两条音轨严格等长并保持节拍同步。明层以玻璃质感拨弦与轻节拍服务于开场消息、角色选择和小额返款阶段；暗层用低频脉冲、时钟声与警示动机对应群聊施压、垫资、假到账、账户冻结与屏幕共享段落。剧情推进时两条音轨连续交叉淡化、不切断节拍，让压力升级同时被听见；音轨由脚本确定性合成，未使用第三方音乐或采样。</w:t>
       </w:r>
     </w:p>
     <w:p>
@@ -915,7 +915,7 @@
           <w:sz w:val="19"/>
           <w:szCs w:val="19"/>
         </w:rPr>
-        <w:t xml:space="preserve">反转二：平台假到账与银行核对</w:t>
+        <w:t xml:space="preserve">反转一：“同学也是传播链上的帮凶”</w:t>
       </w:r>
     </w:p>
     <w:p>
@@ -931,7 +931,7 @@
           <w:sz w:val="22"/>
           <w:szCs w:val="22"/>
         </w:rPr>
-        <w:t xml:space="preserve">支付 399 元后，平台页面显示 520.80 元“结算成功”，这一幕故意让体验者松一口气；切出平台打开银行 App，可用余额没有任何变化。页面数字可以由骗子任意修改，银行或正规支付账户里的实际入账才算数。这是整部作品最核心的教学点，也是标语“第一笔返款先给甜头，连环收割随后登场”的由来。</w:t>
+        <w:t xml:space="preserve">剧情中的周然没有恶意，他只是把自己那一次到账当成了平台可信，并在拉新奖励的驱动下把链接转给了主角。作品刻意保留“无意间”“未经核验”的语境：这一段只讲未经核验的热心会替骗子带路，属于传播链层面的描述，不给同学做法律定性。这个反转让传播链（骗子—周然—主角—室友）第一次被体验者亲眼看见。</w:t>
       </w:r>
     </w:p>
     <w:p>
@@ -948,7 +948,7 @@
           <w:sz w:val="19"/>
           <w:szCs w:val="19"/>
         </w:rPr>
-        <w:t xml:space="preserve">钱包精神状态快问与骗子人才库</w:t>
+        <w:t xml:space="preserve">反转二：平台假到账与银行核对</w:t>
       </w:r>
     </w:p>
     <w:p>
@@ -964,7 +964,7 @@
           <w:sz w:val="22"/>
           <w:szCs w:val="22"/>
         </w:rPr>
-        <w:t xml:space="preserve">通关后的六道快问不考背题，只记录第一反应，据此在“骗子人才库”中给出八款常规外号（熟人小呆瓜、8.8大馋丫头、急急大王等）与三款隐藏款（如“薛定谔的钱包”：反诈题全会、实际遇骗不确定）。每款外号配有插画头像、骗子评语与防御口诀，人才库可逐个点开查看档案，隐藏款的触发条件埋在剧情选择里，鼓励换路径重玩。结果卡由浏览器本地 Canvas 绘制，直接调用系统分享。</w:t>
+        <w:t xml:space="preserve">支付 399 元后，平台页面显示 520.80 元“结算成功”，这一幕故意让体验者松一口气；切出平台打开银行 App，可用余额没有任何变化。页面数字可以由骗子任意修改，银行或正规支付账户里的实际入账才算数。这是整部作品最核心的教学点，也是标语“第一笔返款先给甜头，连环收割随后登场”的由来。</w:t>
       </w:r>
     </w:p>
     <w:p>
@@ -981,7 +981,7 @@
           <w:sz w:val="19"/>
           <w:szCs w:val="19"/>
         </w:rPr>
-        <w:t xml:space="preserve">官方案例与可核验边界</w:t>
+        <w:t xml:space="preserve">钱包精神状态快问与骗子人才库</w:t>
       </w:r>
     </w:p>
     <w:p>
@@ -997,7 +997,7 @@
           <w:sz w:val="22"/>
           <w:szCs w:val="22"/>
         </w:rPr>
-        <w:t xml:space="preserve">复盘环节附四条高校或高校保卫部门发布的官方案例与统计，全部在站内以摘要形式呈现，不跳转外部链接。作品严格区分“高校发布的案例”与“明确为学生受害者的案例”：清华来源是校保卫部转发的北京市反诈中心案例，不写成“清华学生被骗”；上海交大案件数只描述该校统计，不外推为全国高校数据。</w:t>
+        <w:t xml:space="preserve">通关后的六道快问不考背题，只记录第一反应，据此在“骗子人才库”中给出八款常规外号（熟人小呆瓜、8.8大馋丫头、急急大王等）与三款隐藏款（如“薛定谔的钱包”：反诈题全会、实际遇骗不确定）。每款外号配有插画头像、骗子评语与防御口诀，人才库可逐个点开查看档案，隐藏款的触发条件埋在剧情选择里，鼓励换路径重玩。结果卡由浏览器本地 Canvas 绘制，直接调用系统分享。</w:t>
       </w:r>
     </w:p>
     <w:p>
@@ -1014,7 +1014,7 @@
           <w:sz w:val="19"/>
           <w:szCs w:val="19"/>
         </w:rPr>
-        <w:t xml:space="preserve">隐私与技术实现</w:t>
+        <w:t xml:space="preserve">官方案例与可核验边界</w:t>
       </w:r>
     </w:p>
     <w:p>
@@ -1030,7 +1030,7 @@
           <w:sz w:val="22"/>
           <w:szCs w:val="22"/>
         </w:rPr>
-        <w:t xml:space="preserve">整站无后端、无登录，不收集任何答题或身份信息；进度仅保存在浏览器当前标签页。角色立绘、剧情视频与配乐全部为 AI 生成或原创，结果卡在本地绘制。作品完成多端适配：手机为原生竖屏体验，电脑端为 9:16 舞台预览模式，横屏手机提示转回竖屏；支持离线缓存，弱网环境提供带真实进度的开场预载。</w:t>
+        <w:t xml:space="preserve">复盘环节附四条高校或高校保卫部门发布的官方案例与统计，全部在站内以摘要形式呈现，不跳转外部链接。作品严格区分“高校发布的案例”与“明确为学生受害者的案例”：清华来源是校保卫部转发的北京市反诈中心案例，不写成“清华学生被骗”；上海交大案件数只描述该校统计，不外推为全国高校数据。</w:t>
       </w:r>
     </w:p>
     <w:p>
@@ -1047,7 +1047,7 @@
           <w:sz w:val="19"/>
           <w:szCs w:val="19"/>
         </w:rPr>
-        <w:t xml:space="preserve">反诈教育指向</w:t>
+        <w:t xml:space="preserve">隐私与技术实现</w:t>
       </w:r>
     </w:p>
     <w:p>
@@ -1063,7 +1063,904 @@
           <w:sz w:val="22"/>
           <w:szCs w:val="22"/>
         </w:rPr>
+        <w:t xml:space="preserve">整站无后端、无登录，不收集任何答题或身份信息；进度仅保存在浏览器当前标签页。角色立绘、剧情视频与配乐全部为 AI 生成或原创，结果卡在本地绘制。作品完成多端适配：手机为原生竖屏体验，电脑端为 9:16 舞台预览模式，横屏手机提示转回竖屏；支持离线缓存，弱网环境提供带真实进度的开场预载。</w:t>
+      </w:r>
+    </w:p>
+    <w:p>
+      <w:pPr>
+        <w:keepNext/>
+        <w:spacing w:after="60" w:before="220"/>
+      </w:pPr>
+      <w:r>
+        <w:rPr>
+          <w:rFonts w:ascii="Calibri" w:eastAsia="Microsoft YaHei"/>
+          <w:b/>
+          <w:bCs/>
+          <w:color w:val="4F315F"/>
+          <w:sz w:val="19"/>
+          <w:szCs w:val="19"/>
+        </w:rPr>
+        <w:t xml:space="preserve">反诈教育指向</w:t>
+      </w:r>
+    </w:p>
+    <w:p>
+      <w:pPr>
+        <w:spacing w:after="60" w:line="312"/>
+        <w:ind w:firstLine="440"/>
+        <w:jc w:val="both"/>
+      </w:pPr>
+      <w:r>
+        <w:rPr>
+          <w:rFonts w:ascii="Calibri" w:eastAsia="Microsoft YaHei"/>
+          <w:color w:val="26222B"/>
+          <w:sz w:val="22"/>
+          <w:szCs w:val="22"/>
+        </w:rPr>
         <w:t xml:space="preserve">作品把重点放在骗局机制上：熟人信任、小额返款、群体晒单、时间压力与沉没成本如何一步一步接替发挥作用。受害者始终是普通学生，一次普通的点击足以入局。作品希望体验者在下一次看到“到账”时先停下来，独立核验来源，不因为同学转发或页面显示数字就继续付款，也不把未经核验的“机会”继续转给身边人。</w:t>
+      </w:r>
+    </w:p>
+    <w:p>
+      <w:pPr>
+        <w:pStyle w:val="Heading1"/>
+        <w:keepNext/>
+        <w:spacing w:after="120" w:before="420"/>
+      </w:pPr>
+      <w:r>
+        <w:rPr>
+          <w:rFonts w:ascii="Calibri" w:eastAsia="Microsoft YaHei"/>
+          <w:b/>
+          <w:bCs/>
+          <w:color w:val="4F315F"/>
+          <w:sz w:val="32"/>
+          <w:szCs w:val="32"/>
+        </w:rPr>
+        <w:t xml:space="preserve">附：骗子人才库 11 款人格插画</w:t>
+      </w:r>
+    </w:p>
+    <w:tbl>
+      <w:tblPr>
+        <w:tblW w:type="pct" w:w="5000"/>
+        <w:tblBorders>
+          <w:top w:val="none" w:color="FFFFFF" w:sz="0"/>
+          <w:left w:val="none" w:color="FFFFFF" w:sz="0"/>
+          <w:bottom w:val="none" w:color="FFFFFF" w:sz="0"/>
+          <w:right w:val="none" w:color="FFFFFF" w:sz="0"/>
+          <w:insideH w:val="none" w:color="FFFFFF" w:sz="0"/>
+          <w:insideV w:val="none" w:color="FFFFFF" w:sz="0"/>
+        </w:tblBorders>
+      </w:tblPr>
+      <w:tblGrid>
+        <w:gridCol w:w="3298"/>
+        <w:gridCol w:w="3298"/>
+        <w:gridCol w:w="3298"/>
+      </w:tblGrid>
+      <w:tr>
+        <w:trPr>
+          <w:cantSplit/>
+        </w:trPr>
+        <w:tc>
+          <w:tcPr>
+            <w:tcW w:type="pct" w:w="1650"/>
+            <w:tcMar>
+              <w:top w:type="dxa" w:w="60"/>
+              <w:left w:type="dxa" w:w="60"/>
+              <w:bottom w:type="dxa" w:w="60"/>
+              <w:right w:type="dxa" w:w="60"/>
+            </w:tcMar>
+          </w:tcPr>
+          <w:p>
+            <w:pPr>
+              <w:jc w:val="center"/>
+            </w:pPr>
+            <w:r>
+              <w:drawing>
+                <wp:inline distT="0" distB="0" distL="0" distR="0">
+                  <wp:extent cx="1428750" cy="1428750"/>
+                  <wp:effectExtent t="0" r="0" b="0" l="0"/>
+                  <wp:docPr id="2" name="" descr="" title=""/>
+                  <wp:cNvGraphicFramePr>
+                    <a:graphicFrameLocks xmlns:a="http://schemas.openxmlformats.org/drawingml/2006/main" noChangeAspect="1"/>
+                  </wp:cNvGraphicFramePr>
+                  <a:graphic xmlns:a="http://schemas.openxmlformats.org/drawingml/2006/main">
+                    <a:graphicData uri="http://schemas.openxmlformats.org/drawingml/2006/picture">
+                      <pic:pic xmlns:pic="http://schemas.openxmlformats.org/drawingml/2006/picture">
+                        <pic:nvPicPr>
+                          <pic:cNvPr id="0" name="" descr=""/>
+                          <pic:cNvPicPr>
+                            <a:picLocks noChangeAspect="1" noChangeArrowheads="1"/>
+                          </pic:cNvPicPr>
+                        </pic:nvPicPr>
+                        <pic:blipFill>
+                          <a:blip r:embed="rId9" cstate="none"/>
+                          <a:srcRect/>
+                          <a:stretch>
+                            <a:fillRect/>
+                          </a:stretch>
+                        </pic:blipFill>
+                        <pic:spPr bwMode="auto">
+                          <a:xfrm>
+                            <a:off x="0" y="0"/>
+                            <a:ext cx="1428750" cy="1428750"/>
+                          </a:xfrm>
+                          <a:prstGeom prst="rect">
+                            <a:avLst/>
+                          </a:prstGeom>
+                        </pic:spPr>
+                      </pic:pic>
+                    </a:graphicData>
+                  </a:graphic>
+                </wp:inline>
+              </w:drawing>
+            </w:r>
+          </w:p>
+          <w:p>
+            <w:pPr>
+              <w:spacing w:before="40"/>
+              <w:jc w:val="center"/>
+            </w:pPr>
+            <w:r>
+              <w:rPr>
+                <w:rFonts w:ascii="Calibri" w:eastAsia="Microsoft YaHei"/>
+                <w:color w:val="777777"/>
+                <w:sz w:val="17"/>
+                <w:szCs w:val="17"/>
+              </w:rPr>
+              <w:t xml:space="preserve">熟人小呆瓜</w:t>
+            </w:r>
+          </w:p>
+        </w:tc>
+        <w:tc>
+          <w:tcPr>
+            <w:tcW w:type="pct" w:w="1650"/>
+            <w:tcMar>
+              <w:top w:type="dxa" w:w="60"/>
+              <w:left w:type="dxa" w:w="60"/>
+              <w:bottom w:type="dxa" w:w="60"/>
+              <w:right w:type="dxa" w:w="60"/>
+            </w:tcMar>
+          </w:tcPr>
+          <w:p>
+            <w:pPr>
+              <w:jc w:val="center"/>
+            </w:pPr>
+            <w:r>
+              <w:drawing>
+                <wp:inline distT="0" distB="0" distL="0" distR="0">
+                  <wp:extent cx="1428750" cy="1428750"/>
+                  <wp:effectExtent t="0" r="0" b="0" l="0"/>
+                  <wp:docPr id="3" name="" descr="" title=""/>
+                  <wp:cNvGraphicFramePr>
+                    <a:graphicFrameLocks xmlns:a="http://schemas.openxmlformats.org/drawingml/2006/main" noChangeAspect="1"/>
+                  </wp:cNvGraphicFramePr>
+                  <a:graphic xmlns:a="http://schemas.openxmlformats.org/drawingml/2006/main">
+                    <a:graphicData uri="http://schemas.openxmlformats.org/drawingml/2006/picture">
+                      <pic:pic xmlns:pic="http://schemas.openxmlformats.org/drawingml/2006/picture">
+                        <pic:nvPicPr>
+                          <pic:cNvPr id="0" name="" descr=""/>
+                          <pic:cNvPicPr>
+                            <a:picLocks noChangeAspect="1" noChangeArrowheads="1"/>
+                          </pic:cNvPicPr>
+                        </pic:nvPicPr>
+                        <pic:blipFill>
+                          <a:blip r:embed="rId10" cstate="none"/>
+                          <a:srcRect/>
+                          <a:stretch>
+                            <a:fillRect/>
+                          </a:stretch>
+                        </pic:blipFill>
+                        <pic:spPr bwMode="auto">
+                          <a:xfrm>
+                            <a:off x="0" y="0"/>
+                            <a:ext cx="1428750" cy="1428750"/>
+                          </a:xfrm>
+                          <a:prstGeom prst="rect">
+                            <a:avLst/>
+                          </a:prstGeom>
+                        </pic:spPr>
+                      </pic:pic>
+                    </a:graphicData>
+                  </a:graphic>
+                </wp:inline>
+              </w:drawing>
+            </w:r>
+          </w:p>
+          <w:p>
+            <w:pPr>
+              <w:spacing w:before="40"/>
+              <w:jc w:val="center"/>
+            </w:pPr>
+            <w:r>
+              <w:rPr>
+                <w:rFonts w:ascii="Calibri" w:eastAsia="Microsoft YaHei"/>
+                <w:color w:val="777777"/>
+                <w:sz w:val="17"/>
+                <w:szCs w:val="17"/>
+              </w:rPr>
+              <w:t xml:space="preserve">8.8大馋丫头</w:t>
+            </w:r>
+          </w:p>
+        </w:tc>
+        <w:tc>
+          <w:tcPr>
+            <w:tcW w:type="pct" w:w="1650"/>
+            <w:tcMar>
+              <w:top w:type="dxa" w:w="60"/>
+              <w:left w:type="dxa" w:w="60"/>
+              <w:bottom w:type="dxa" w:w="60"/>
+              <w:right w:type="dxa" w:w="60"/>
+            </w:tcMar>
+          </w:tcPr>
+          <w:p>
+            <w:pPr>
+              <w:jc w:val="center"/>
+            </w:pPr>
+            <w:r>
+              <w:drawing>
+                <wp:inline distT="0" distB="0" distL="0" distR="0">
+                  <wp:extent cx="1428750" cy="1428750"/>
+                  <wp:effectExtent t="0" r="0" b="0" l="0"/>
+                  <wp:docPr id="4" name="" descr="" title=""/>
+                  <wp:cNvGraphicFramePr>
+                    <a:graphicFrameLocks xmlns:a="http://schemas.openxmlformats.org/drawingml/2006/main" noChangeAspect="1"/>
+                  </wp:cNvGraphicFramePr>
+                  <a:graphic xmlns:a="http://schemas.openxmlformats.org/drawingml/2006/main">
+                    <a:graphicData uri="http://schemas.openxmlformats.org/drawingml/2006/picture">
+                      <pic:pic xmlns:pic="http://schemas.openxmlformats.org/drawingml/2006/picture">
+                        <pic:nvPicPr>
+                          <pic:cNvPr id="0" name="" descr=""/>
+                          <pic:cNvPicPr>
+                            <a:picLocks noChangeAspect="1" noChangeArrowheads="1"/>
+                          </pic:cNvPicPr>
+                        </pic:nvPicPr>
+                        <pic:blipFill>
+                          <a:blip r:embed="rId11" cstate="none"/>
+                          <a:srcRect/>
+                          <a:stretch>
+                            <a:fillRect/>
+                          </a:stretch>
+                        </pic:blipFill>
+                        <pic:spPr bwMode="auto">
+                          <a:xfrm>
+                            <a:off x="0" y="0"/>
+                            <a:ext cx="1428750" cy="1428750"/>
+                          </a:xfrm>
+                          <a:prstGeom prst="rect">
+                            <a:avLst/>
+                          </a:prstGeom>
+                        </pic:spPr>
+                      </pic:pic>
+                    </a:graphicData>
+                  </a:graphic>
+                </wp:inline>
+              </w:drawing>
+            </w:r>
+          </w:p>
+          <w:p>
+            <w:pPr>
+              <w:spacing w:before="40"/>
+              <w:jc w:val="center"/>
+            </w:pPr>
+            <w:r>
+              <w:rPr>
+                <w:rFonts w:ascii="Calibri" w:eastAsia="Microsoft YaHei"/>
+                <w:color w:val="777777"/>
+                <w:sz w:val="17"/>
+                <w:szCs w:val="17"/>
+              </w:rPr>
+              <w:t xml:space="preserve">急急大王</w:t>
+            </w:r>
+          </w:p>
+        </w:tc>
+      </w:tr>
+      <w:tr>
+        <w:trPr>
+          <w:cantSplit/>
+        </w:trPr>
+        <w:tc>
+          <w:tcPr>
+            <w:tcW w:type="pct" w:w="1650"/>
+            <w:tcMar>
+              <w:top w:type="dxa" w:w="60"/>
+              <w:left w:type="dxa" w:w="60"/>
+              <w:bottom w:type="dxa" w:w="60"/>
+              <w:right w:type="dxa" w:w="60"/>
+            </w:tcMar>
+          </w:tcPr>
+          <w:p>
+            <w:pPr>
+              <w:jc w:val="center"/>
+            </w:pPr>
+            <w:r>
+              <w:drawing>
+                <wp:inline distT="0" distB="0" distL="0" distR="0">
+                  <wp:extent cx="1428750" cy="1428750"/>
+                  <wp:effectExtent t="0" r="0" b="0" l="0"/>
+                  <wp:docPr id="5" name="" descr="" title=""/>
+                  <wp:cNvGraphicFramePr>
+                    <a:graphicFrameLocks xmlns:a="http://schemas.openxmlformats.org/drawingml/2006/main" noChangeAspect="1"/>
+                  </wp:cNvGraphicFramePr>
+                  <a:graphic xmlns:a="http://schemas.openxmlformats.org/drawingml/2006/main">
+                    <a:graphicData uri="http://schemas.openxmlformats.org/drawingml/2006/picture">
+                      <pic:pic xmlns:pic="http://schemas.openxmlformats.org/drawingml/2006/picture">
+                        <pic:nvPicPr>
+                          <pic:cNvPr id="0" name="" descr=""/>
+                          <pic:cNvPicPr>
+                            <a:picLocks noChangeAspect="1" noChangeArrowheads="1"/>
+                          </pic:cNvPicPr>
+                        </pic:nvPicPr>
+                        <pic:blipFill>
+                          <a:blip r:embed="rId12" cstate="none"/>
+                          <a:srcRect/>
+                          <a:stretch>
+                            <a:fillRect/>
+                          </a:stretch>
+                        </pic:blipFill>
+                        <pic:spPr bwMode="auto">
+                          <a:xfrm>
+                            <a:off x="0" y="0"/>
+                            <a:ext cx="1428750" cy="1428750"/>
+                          </a:xfrm>
+                          <a:prstGeom prst="rect">
+                            <a:avLst/>
+                          </a:prstGeom>
+                        </pic:spPr>
+                      </pic:pic>
+                    </a:graphicData>
+                  </a:graphic>
+                </wp:inline>
+              </w:drawing>
+            </w:r>
+          </w:p>
+          <w:p>
+            <w:pPr>
+              <w:spacing w:before="40"/>
+              <w:jc w:val="center"/>
+            </w:pPr>
+            <w:r>
+              <w:rPr>
+                <w:rFonts w:ascii="Calibri" w:eastAsia="Microsoft YaHei"/>
+                <w:color w:val="777777"/>
+                <w:sz w:val="17"/>
+                <w:szCs w:val="17"/>
+              </w:rPr>
+              <w:t xml:space="preserve">热心肠宝宝</w:t>
+            </w:r>
+          </w:p>
+        </w:tc>
+        <w:tc>
+          <w:tcPr>
+            <w:tcW w:type="pct" w:w="1650"/>
+            <w:tcMar>
+              <w:top w:type="dxa" w:w="60"/>
+              <w:left w:type="dxa" w:w="60"/>
+              <w:bottom w:type="dxa" w:w="60"/>
+              <w:right w:type="dxa" w:w="60"/>
+            </w:tcMar>
+          </w:tcPr>
+          <w:p>
+            <w:pPr>
+              <w:jc w:val="center"/>
+            </w:pPr>
+            <w:r>
+              <w:drawing>
+                <wp:inline distT="0" distB="0" distL="0" distR="0">
+                  <wp:extent cx="1428750" cy="1428750"/>
+                  <wp:effectExtent t="0" r="0" b="0" l="0"/>
+                  <wp:docPr id="6" name="" descr="" title=""/>
+                  <wp:cNvGraphicFramePr>
+                    <a:graphicFrameLocks xmlns:a="http://schemas.openxmlformats.org/drawingml/2006/main" noChangeAspect="1"/>
+                  </wp:cNvGraphicFramePr>
+                  <a:graphic xmlns:a="http://schemas.openxmlformats.org/drawingml/2006/main">
+                    <a:graphicData uri="http://schemas.openxmlformats.org/drawingml/2006/picture">
+                      <pic:pic xmlns:pic="http://schemas.openxmlformats.org/drawingml/2006/picture">
+                        <pic:nvPicPr>
+                          <pic:cNvPr id="0" name="" descr=""/>
+                          <pic:cNvPicPr>
+                            <a:picLocks noChangeAspect="1" noChangeArrowheads="1"/>
+                          </pic:cNvPicPr>
+                        </pic:nvPicPr>
+                        <pic:blipFill>
+                          <a:blip r:embed="rId13" cstate="none"/>
+                          <a:srcRect/>
+                          <a:stretch>
+                            <a:fillRect/>
+                          </a:stretch>
+                        </pic:blipFill>
+                        <pic:spPr bwMode="auto">
+                          <a:xfrm>
+                            <a:off x="0" y="0"/>
+                            <a:ext cx="1428750" cy="1428750"/>
+                          </a:xfrm>
+                          <a:prstGeom prst="rect">
+                            <a:avLst/>
+                          </a:prstGeom>
+                        </pic:spPr>
+                      </pic:pic>
+                    </a:graphicData>
+                  </a:graphic>
+                </wp:inline>
+              </w:drawing>
+            </w:r>
+          </w:p>
+          <w:p>
+            <w:pPr>
+              <w:spacing w:before="40"/>
+              <w:jc w:val="center"/>
+            </w:pPr>
+            <w:r>
+              <w:rPr>
+                <w:rFonts w:ascii="Calibri" w:eastAsia="Microsoft YaHei"/>
+                <w:color w:val="777777"/>
+                <w:sz w:val="17"/>
+                <w:szCs w:val="17"/>
+              </w:rPr>
+              <w:t xml:space="preserve">气氛组宝宝</w:t>
+            </w:r>
+          </w:p>
+        </w:tc>
+        <w:tc>
+          <w:tcPr>
+            <w:tcW w:type="pct" w:w="1650"/>
+            <w:tcMar>
+              <w:top w:type="dxa" w:w="60"/>
+              <w:left w:type="dxa" w:w="60"/>
+              <w:bottom w:type="dxa" w:w="60"/>
+              <w:right w:type="dxa" w:w="60"/>
+            </w:tcMar>
+          </w:tcPr>
+          <w:p>
+            <w:pPr>
+              <w:jc w:val="center"/>
+            </w:pPr>
+            <w:r>
+              <w:drawing>
+                <wp:inline distT="0" distB="0" distL="0" distR="0">
+                  <wp:extent cx="1428750" cy="1428750"/>
+                  <wp:effectExtent t="0" r="0" b="0" l="0"/>
+                  <wp:docPr id="7" name="" descr="" title=""/>
+                  <wp:cNvGraphicFramePr>
+                    <a:graphicFrameLocks xmlns:a="http://schemas.openxmlformats.org/drawingml/2006/main" noChangeAspect="1"/>
+                  </wp:cNvGraphicFramePr>
+                  <a:graphic xmlns:a="http://schemas.openxmlformats.org/drawingml/2006/main">
+                    <a:graphicData uri="http://schemas.openxmlformats.org/drawingml/2006/picture">
+                      <pic:pic xmlns:pic="http://schemas.openxmlformats.org/drawingml/2006/picture">
+                        <pic:nvPicPr>
+                          <pic:cNvPr id="0" name="" descr=""/>
+                          <pic:cNvPicPr>
+                            <a:picLocks noChangeAspect="1" noChangeArrowheads="1"/>
+                          </pic:cNvPicPr>
+                        </pic:nvPicPr>
+                        <pic:blipFill>
+                          <a:blip r:embed="rId14" cstate="none"/>
+                          <a:srcRect/>
+                          <a:stretch>
+                            <a:fillRect/>
+                          </a:stretch>
+                        </pic:blipFill>
+                        <pic:spPr bwMode="auto">
+                          <a:xfrm>
+                            <a:off x="0" y="0"/>
+                            <a:ext cx="1428750" cy="1428750"/>
+                          </a:xfrm>
+                          <a:prstGeom prst="rect">
+                            <a:avLst/>
+                          </a:prstGeom>
+                        </pic:spPr>
+                      </pic:pic>
+                    </a:graphicData>
+                  </a:graphic>
+                </wp:inline>
+              </w:drawing>
+            </w:r>
+          </w:p>
+          <w:p>
+            <w:pPr>
+              <w:spacing w:before="40"/>
+              <w:jc w:val="center"/>
+            </w:pPr>
+            <w:r>
+              <w:rPr>
+                <w:rFonts w:ascii="Calibri" w:eastAsia="Microsoft YaHei"/>
+                <w:color w:val="777777"/>
+                <w:sz w:val="17"/>
+                <w:szCs w:val="17"/>
+              </w:rPr>
+              <w:t xml:space="preserve">回本犟种</w:t>
+            </w:r>
+          </w:p>
+        </w:tc>
+      </w:tr>
+      <w:tr>
+        <w:trPr>
+          <w:cantSplit/>
+        </w:trPr>
+        <w:tc>
+          <w:tcPr>
+            <w:tcW w:type="pct" w:w="1650"/>
+            <w:tcMar>
+              <w:top w:type="dxa" w:w="60"/>
+              <w:left w:type="dxa" w:w="60"/>
+              <w:bottom w:type="dxa" w:w="60"/>
+              <w:right w:type="dxa" w:w="60"/>
+            </w:tcMar>
+          </w:tcPr>
+          <w:p>
+            <w:pPr>
+              <w:jc w:val="center"/>
+            </w:pPr>
+            <w:r>
+              <w:drawing>
+                <wp:inline distT="0" distB="0" distL="0" distR="0">
+                  <wp:extent cx="1428750" cy="1428750"/>
+                  <wp:effectExtent t="0" r="0" b="0" l="0"/>
+                  <wp:docPr id="8" name="" descr="" title=""/>
+                  <wp:cNvGraphicFramePr>
+                    <a:graphicFrameLocks xmlns:a="http://schemas.openxmlformats.org/drawingml/2006/main" noChangeAspect="1"/>
+                  </wp:cNvGraphicFramePr>
+                  <a:graphic xmlns:a="http://schemas.openxmlformats.org/drawingml/2006/main">
+                    <a:graphicData uri="http://schemas.openxmlformats.org/drawingml/2006/picture">
+                      <pic:pic xmlns:pic="http://schemas.openxmlformats.org/drawingml/2006/picture">
+                        <pic:nvPicPr>
+                          <pic:cNvPr id="0" name="" descr=""/>
+                          <pic:cNvPicPr>
+                            <a:picLocks noChangeAspect="1" noChangeArrowheads="1"/>
+                          </pic:cNvPicPr>
+                        </pic:nvPicPr>
+                        <pic:blipFill>
+                          <a:blip r:embed="rId15" cstate="none"/>
+                          <a:srcRect/>
+                          <a:stretch>
+                            <a:fillRect/>
+                          </a:stretch>
+                        </pic:blipFill>
+                        <pic:spPr bwMode="auto">
+                          <a:xfrm>
+                            <a:off x="0" y="0"/>
+                            <a:ext cx="1428750" cy="1428750"/>
+                          </a:xfrm>
+                          <a:prstGeom prst="rect">
+                            <a:avLst/>
+                          </a:prstGeom>
+                        </pic:spPr>
+                      </pic:pic>
+                    </a:graphicData>
+                  </a:graphic>
+                </wp:inline>
+              </w:drawing>
+            </w:r>
+          </w:p>
+          <w:p>
+            <w:pPr>
+              <w:spacing w:before="40"/>
+              <w:jc w:val="center"/>
+            </w:pPr>
+            <w:r>
+              <w:rPr>
+                <w:rFonts w:ascii="Calibri" w:eastAsia="Microsoft YaHei"/>
+                <w:color w:val="777777"/>
+                <w:sz w:val="17"/>
+                <w:szCs w:val="17"/>
+              </w:rPr>
+              <w:t xml:space="preserve">客服乖宝宝</w:t>
+            </w:r>
+          </w:p>
+        </w:tc>
+        <w:tc>
+          <w:tcPr>
+            <w:tcW w:type="pct" w:w="1650"/>
+            <w:tcMar>
+              <w:top w:type="dxa" w:w="60"/>
+              <w:left w:type="dxa" w:w="60"/>
+              <w:bottom w:type="dxa" w:w="60"/>
+              <w:right w:type="dxa" w:w="60"/>
+            </w:tcMar>
+          </w:tcPr>
+          <w:p>
+            <w:pPr>
+              <w:jc w:val="center"/>
+            </w:pPr>
+            <w:r>
+              <w:drawing>
+                <wp:inline distT="0" distB="0" distL="0" distR="0">
+                  <wp:extent cx="1428750" cy="1428750"/>
+                  <wp:effectExtent t="0" r="0" b="0" l="0"/>
+                  <wp:docPr id="9" name="" descr="" title=""/>
+                  <wp:cNvGraphicFramePr>
+                    <a:graphicFrameLocks xmlns:a="http://schemas.openxmlformats.org/drawingml/2006/main" noChangeAspect="1"/>
+                  </wp:cNvGraphicFramePr>
+                  <a:graphic xmlns:a="http://schemas.openxmlformats.org/drawingml/2006/main">
+                    <a:graphicData uri="http://schemas.openxmlformats.org/drawingml/2006/picture">
+                      <pic:pic xmlns:pic="http://schemas.openxmlformats.org/drawingml/2006/picture">
+                        <pic:nvPicPr>
+                          <pic:cNvPr id="0" name="" descr=""/>
+                          <pic:cNvPicPr>
+                            <a:picLocks noChangeAspect="1" noChangeArrowheads="1"/>
+                          </pic:cNvPicPr>
+                        </pic:nvPicPr>
+                        <pic:blipFill>
+                          <a:blip r:embed="rId16" cstate="none"/>
+                          <a:srcRect/>
+                          <a:stretch>
+                            <a:fillRect/>
+                          </a:stretch>
+                        </pic:blipFill>
+                        <pic:spPr bwMode="auto">
+                          <a:xfrm>
+                            <a:off x="0" y="0"/>
+                            <a:ext cx="1428750" cy="1428750"/>
+                          </a:xfrm>
+                          <a:prstGeom prst="rect">
+                            <a:avLst/>
+                          </a:prstGeom>
+                        </pic:spPr>
+                      </pic:pic>
+                    </a:graphicData>
+                  </a:graphic>
+                </wp:inline>
+              </w:drawing>
+            </w:r>
+          </w:p>
+          <w:p>
+            <w:pPr>
+              <w:spacing w:before="40"/>
+              <w:jc w:val="center"/>
+            </w:pPr>
+            <w:r>
+              <w:rPr>
+                <w:rFonts w:ascii="Calibri" w:eastAsia="Microsoft YaHei"/>
+                <w:color w:val="777777"/>
+                <w:sz w:val="17"/>
+                <w:szCs w:val="17"/>
+              </w:rPr>
+              <w:t xml:space="preserve">较真小天才</w:t>
+            </w:r>
+          </w:p>
+        </w:tc>
+        <w:tc>
+          <w:tcPr>
+            <w:tcW w:type="pct" w:w="1650"/>
+            <w:tcMar>
+              <w:top w:type="dxa" w:w="60"/>
+              <w:left w:type="dxa" w:w="60"/>
+              <w:bottom w:type="dxa" w:w="60"/>
+              <w:right w:type="dxa" w:w="60"/>
+            </w:tcMar>
+          </w:tcPr>
+          <w:p>
+            <w:pPr>
+              <w:jc w:val="center"/>
+            </w:pPr>
+            <w:r>
+              <w:drawing>
+                <wp:inline distT="0" distB="0" distL="0" distR="0">
+                  <wp:extent cx="1428750" cy="1428750"/>
+                  <wp:effectExtent t="0" r="0" b="0" l="0"/>
+                  <wp:docPr id="10" name="" descr="" title=""/>
+                  <wp:cNvGraphicFramePr>
+                    <a:graphicFrameLocks xmlns:a="http://schemas.openxmlformats.org/drawingml/2006/main" noChangeAspect="1"/>
+                  </wp:cNvGraphicFramePr>
+                  <a:graphic xmlns:a="http://schemas.openxmlformats.org/drawingml/2006/main">
+                    <a:graphicData uri="http://schemas.openxmlformats.org/drawingml/2006/picture">
+                      <pic:pic xmlns:pic="http://schemas.openxmlformats.org/drawingml/2006/picture">
+                        <pic:nvPicPr>
+                          <pic:cNvPr id="0" name="" descr=""/>
+                          <pic:cNvPicPr>
+                            <a:picLocks noChangeAspect="1" noChangeArrowheads="1"/>
+                          </pic:cNvPicPr>
+                        </pic:nvPicPr>
+                        <pic:blipFill>
+                          <a:blip r:embed="rId17" cstate="none"/>
+                          <a:srcRect/>
+                          <a:stretch>
+                            <a:fillRect/>
+                          </a:stretch>
+                        </pic:blipFill>
+                        <pic:spPr bwMode="auto">
+                          <a:xfrm>
+                            <a:off x="0" y="0"/>
+                            <a:ext cx="1428750" cy="1428750"/>
+                          </a:xfrm>
+                          <a:prstGeom prst="rect">
+                            <a:avLst/>
+                          </a:prstGeom>
+                        </pic:spPr>
+                      </pic:pic>
+                    </a:graphicData>
+                  </a:graphic>
+                </wp:inline>
+              </w:drawing>
+            </w:r>
+          </w:p>
+          <w:p>
+            <w:pPr>
+              <w:spacing w:before="40"/>
+              <w:jc w:val="center"/>
+            </w:pPr>
+            <w:r>
+              <w:rPr>
+                <w:rFonts w:ascii="Calibri" w:eastAsia="Microsoft YaHei"/>
+                <w:color w:val="777777"/>
+                <w:sz w:val="17"/>
+                <w:szCs w:val="17"/>
+              </w:rPr>
+              <w:t xml:space="preserve">薛定谔的钱包（隐藏款）</w:t>
+            </w:r>
+          </w:p>
+        </w:tc>
+      </w:tr>
+      <w:tr>
+        <w:trPr>
+          <w:cantSplit/>
+        </w:trPr>
+        <w:tc>
+          <w:tcPr>
+            <w:tcW w:type="pct" w:w="1650"/>
+            <w:tcMar>
+              <w:top w:type="dxa" w:w="60"/>
+              <w:left w:type="dxa" w:w="60"/>
+              <w:bottom w:type="dxa" w:w="60"/>
+              <w:right w:type="dxa" w:w="60"/>
+            </w:tcMar>
+          </w:tcPr>
+          <w:p>
+            <w:pPr>
+              <w:jc w:val="center"/>
+            </w:pPr>
+            <w:r>
+              <w:drawing>
+                <wp:inline distT="0" distB="0" distL="0" distR="0">
+                  <wp:extent cx="1428750" cy="1428750"/>
+                  <wp:effectExtent t="0" r="0" b="0" l="0"/>
+                  <wp:docPr id="11" name="" descr="" title=""/>
+                  <wp:cNvGraphicFramePr>
+                    <a:graphicFrameLocks xmlns:a="http://schemas.openxmlformats.org/drawingml/2006/main" noChangeAspect="1"/>
+                  </wp:cNvGraphicFramePr>
+                  <a:graphic xmlns:a="http://schemas.openxmlformats.org/drawingml/2006/main">
+                    <a:graphicData uri="http://schemas.openxmlformats.org/drawingml/2006/picture">
+                      <pic:pic xmlns:pic="http://schemas.openxmlformats.org/drawingml/2006/picture">
+                        <pic:nvPicPr>
+                          <pic:cNvPr id="0" name="" descr=""/>
+                          <pic:cNvPicPr>
+                            <a:picLocks noChangeAspect="1" noChangeArrowheads="1"/>
+                          </pic:cNvPicPr>
+                        </pic:nvPicPr>
+                        <pic:blipFill>
+                          <a:blip r:embed="rId18" cstate="none"/>
+                          <a:srcRect/>
+                          <a:stretch>
+                            <a:fillRect/>
+                          </a:stretch>
+                        </pic:blipFill>
+                        <pic:spPr bwMode="auto">
+                          <a:xfrm>
+                            <a:off x="0" y="0"/>
+                            <a:ext cx="1428750" cy="1428750"/>
+                          </a:xfrm>
+                          <a:prstGeom prst="rect">
+                            <a:avLst/>
+                          </a:prstGeom>
+                        </pic:spPr>
+                      </pic:pic>
+                    </a:graphicData>
+                  </a:graphic>
+                </wp:inline>
+              </w:drawing>
+            </w:r>
+          </w:p>
+          <w:p>
+            <w:pPr>
+              <w:spacing w:before="40"/>
+              <w:jc w:val="center"/>
+            </w:pPr>
+            <w:r>
+              <w:rPr>
+                <w:rFonts w:ascii="Calibri" w:eastAsia="Microsoft YaHei"/>
+                <w:color w:val="777777"/>
+                <w:sz w:val="17"/>
+                <w:szCs w:val="17"/>
+              </w:rPr>
+              <w:t xml:space="preserve">反诈小杠精（隐藏款）</w:t>
+            </w:r>
+          </w:p>
+        </w:tc>
+        <w:tc>
+          <w:tcPr>
+            <w:tcW w:type="pct" w:w="1650"/>
+            <w:tcMar>
+              <w:top w:type="dxa" w:w="60"/>
+              <w:left w:type="dxa" w:w="60"/>
+              <w:bottom w:type="dxa" w:w="60"/>
+              <w:right w:type="dxa" w:w="60"/>
+            </w:tcMar>
+          </w:tcPr>
+          <w:p>
+            <w:pPr>
+              <w:jc w:val="center"/>
+            </w:pPr>
+            <w:r>
+              <w:drawing>
+                <wp:inline distT="0" distB="0" distL="0" distR="0">
+                  <wp:extent cx="1428750" cy="1428750"/>
+                  <wp:effectExtent t="0" r="0" b="0" l="0"/>
+                  <wp:docPr id="12" name="" descr="" title=""/>
+                  <wp:cNvGraphicFramePr>
+                    <a:graphicFrameLocks xmlns:a="http://schemas.openxmlformats.org/drawingml/2006/main" noChangeAspect="1"/>
+                  </wp:cNvGraphicFramePr>
+                  <a:graphic xmlns:a="http://schemas.openxmlformats.org/drawingml/2006/main">
+                    <a:graphicData uri="http://schemas.openxmlformats.org/drawingml/2006/picture">
+                      <pic:pic xmlns:pic="http://schemas.openxmlformats.org/drawingml/2006/picture">
+                        <pic:nvPicPr>
+                          <pic:cNvPr id="0" name="" descr=""/>
+                          <pic:cNvPicPr>
+                            <a:picLocks noChangeAspect="1" noChangeArrowheads="1"/>
+                          </pic:cNvPicPr>
+                        </pic:nvPicPr>
+                        <pic:blipFill>
+                          <a:blip r:embed="rId19" cstate="none"/>
+                          <a:srcRect/>
+                          <a:stretch>
+                            <a:fillRect/>
+                          </a:stretch>
+                        </pic:blipFill>
+                        <pic:spPr bwMode="auto">
+                          <a:xfrm>
+                            <a:off x="0" y="0"/>
+                            <a:ext cx="1428750" cy="1428750"/>
+                          </a:xfrm>
+                          <a:prstGeom prst="rect">
+                            <a:avLst/>
+                          </a:prstGeom>
+                        </pic:spPr>
+                      </pic:pic>
+                    </a:graphicData>
+                  </a:graphic>
+                </wp:inline>
+              </w:drawing>
+            </w:r>
+          </w:p>
+          <w:p>
+            <w:pPr>
+              <w:spacing w:before="40"/>
+              <w:jc w:val="center"/>
+            </w:pPr>
+            <w:r>
+              <w:rPr>
+                <w:rFonts w:ascii="Calibri" w:eastAsia="Microsoft YaHei"/>
+                <w:color w:val="777777"/>
+                <w:sz w:val="17"/>
+                <w:szCs w:val="17"/>
+              </w:rPr>
+              <w:t xml:space="preserve">剧情沉浸式内测员（隐藏款）</w:t>
+            </w:r>
+          </w:p>
+        </w:tc>
+        <w:tc>
+          <w:tcPr>
+            <w:tcW w:type="pct" w:w="1650"/>
+            <w:tcMar>
+              <w:top w:type="dxa" w:w="60"/>
+              <w:left w:type="dxa" w:w="60"/>
+              <w:bottom w:type="dxa" w:w="60"/>
+              <w:right w:type="dxa" w:w="60"/>
+            </w:tcMar>
+          </w:tcPr>
+          <w:p/>
+        </w:tc>
+      </w:tr>
+    </w:tbl>
+    <w:p>
+      <w:pPr>
+        <w:spacing w:after="120" w:before="40"/>
+        <w:jc w:val="center"/>
+      </w:pPr>
+      <w:r>
+        <w:rPr>
+          <w:rFonts w:ascii="Calibri" w:eastAsia="Microsoft YaHei"/>
+          <w:color w:val="777777"/>
+          <w:sz w:val="17"/>
+          <w:szCs w:val="17"/>
+        </w:rPr>
+        <w:t xml:space="preserve">前八款为常规款，后三款为隐藏款（薛定谔的钱包、反诈小杠精、剧情沉浸式内测员）。插画均由 AI 生成，结果页、人才库弹层与分享卡共用同一套图像。</w:t>
       </w:r>
     </w:p>
     <w:p>

</xml_diff>